<commit_message>
update srs with 3 low-fi wireframes and 3 hi-fi ui ux
</commit_message>
<xml_diff>
--- a/SRS_Cafe_RJ.docx
+++ b/SRS_Cafe_RJ.docx
@@ -28,7 +28,7 @@
           <w:rFonts w:ascii="Arial" w:hAnsi="Arial"/>
           <w:b/>
           <w:i w:val="0"/>
-          <w:color w:val="323232"/>
+          <w:color w:val="000000"/>
           <w:sz w:val="22"/>
         </w:rPr>
         <w:t>SISTEM INFORMASI POINT OF SALE (POS) CAFE RJ</w:t>
@@ -429,7 +429,7 @@
           <w:color w:val="000000"/>
           <w:sz w:val="22"/>
         </w:rPr>
-        <w:t>Pencatatan nota kasir fisik berisiko hilang, robek, atau basah terkena tumpahan minuman.</w:t>
+        <w:t>Pencatatan nota fisik kasir berisiko hilang, robek, atau basah terkena tumpahan minuman.</w:t>
       </w:r>
     </w:p>
     <w:p>
@@ -1271,9 +1271,9 @@
       </w:tr>
     </w:tbl>
     <w:p>
-      <w:pPr>
-        <w:spacing w:after="120"/>
-      </w:pPr>
+      <w:r>
+        <w:br w:type="page"/>
+      </w:r>
     </w:p>
     <w:p>
       <w:pPr>
@@ -1690,7 +1690,7 @@
           <w:color w:val="000000"/>
           <w:sz w:val="22"/>
         </w:rPr>
-        <w:t>Perancangan Sistem: Membuat diagram Use Case, Activity Diagram, ERD, DFD, dan rancangan mockup UI/UX.</w:t>
+        <w:t>Perancangan Sistem: Membuat diagram Use Case, Activity Diagram, ERD, DFD, serta wireframe dan mockup antarmuka.</w:t>
       </w:r>
     </w:p>
     <w:p>
@@ -2014,6 +2014,7 @@
     </w:p>
     <w:p>
       <w:pPr>
+        <w:spacing w:before="120" w:after="40"/>
         <w:jc w:val="center"/>
       </w:pPr>
     </w:p>
@@ -2055,6 +2056,7 @@
     </w:p>
     <w:p>
       <w:pPr>
+        <w:spacing w:after="200"/>
         <w:jc w:val="center"/>
       </w:pPr>
       <w:r>
@@ -2062,7 +2064,7 @@
           <w:rFonts w:ascii="Arial" w:hAnsi="Arial"/>
           <w:b w:val="0"/>
           <w:i/>
-          <w:color w:val="505050"/>
+          <w:color w:val="3C3C3C"/>
           <w:sz w:val="19"/>
         </w:rPr>
         <w:t>Gambar 3.1: Use Case Diagram Aplikasi Kasir Cafe RJ</w:t>
@@ -2080,7 +2082,7 @@
           <w:color w:val="000000"/>
           <w:sz w:val="22"/>
         </w:rPr>
-        <w:t>Tabel Pemetaan Hak Akses Fitur:</w:t>
+        <w:t>Tabel Pemetaan Hak Akses Fitur Antara Kasir dan Admin:</w:t>
       </w:r>
     </w:p>
     <w:tbl>
@@ -2846,11 +2848,12 @@
           <w:color w:val="000000"/>
           <w:sz w:val="22"/>
         </w:rPr>
-        <w:t>Activity Diagram berikut menggambarkan urutan langkah prosedural yang dijalankan kasir dalam melayani pesanan pelanggan, memilih metode pembayaran, hingga mencetak bukti struk belanja:</w:t>
+        <w:t>Activity Diagram berikut menggambarkan urutan langkah prosedural kasir dalam melayani pesanan, memilih metode bayar, hingga mencetak bukti struk:</w:t>
       </w:r>
     </w:p>
     <w:p>
       <w:pPr>
+        <w:spacing w:before="120" w:after="40"/>
         <w:jc w:val="center"/>
       </w:pPr>
     </w:p>
@@ -2858,7 +2861,7 @@
       <w:r>
         <w:drawing>
           <wp:inline xmlns:a="http://schemas.openxmlformats.org/drawingml/2006/main" xmlns:pic="http://schemas.openxmlformats.org/drawingml/2006/picture">
-            <wp:extent cx="4572000" cy="5486400"/>
+            <wp:extent cx="4389120" cy="5266944"/>
             <wp:docPr id="2" name="Picture 2"/>
             <wp:cNvGraphicFramePr>
               <a:graphicFrameLocks noChangeAspect="1"/>
@@ -2879,7 +2882,7 @@
                   <pic:spPr>
                     <a:xfrm>
                       <a:off x="0" y="0"/>
-                      <a:ext cx="4572000" cy="5486400"/>
+                      <a:ext cx="4389120" cy="5266944"/>
                     </a:xfrm>
                     <a:prstGeom prst="rect"/>
                   </pic:spPr>
@@ -2892,6 +2895,7 @@
     </w:p>
     <w:p>
       <w:pPr>
+        <w:spacing w:after="200"/>
         <w:jc w:val="center"/>
       </w:pPr>
       <w:r>
@@ -2899,7 +2903,7 @@
           <w:rFonts w:ascii="Arial" w:hAnsi="Arial"/>
           <w:b w:val="0"/>
           <w:i/>
-          <w:color w:val="505050"/>
+          <w:color w:val="3C3C3C"/>
           <w:sz w:val="19"/>
         </w:rPr>
         <w:t>Gambar 3.2: Activity Diagram Alur Transaksi Kasir POS</w:t>
@@ -2938,11 +2942,12 @@
           <w:color w:val="000000"/>
           <w:sz w:val="22"/>
         </w:rPr>
-        <w:t>ERD di bawah ini memetakan relasi antara 5 tabel basis data MySQL yang digunakan pada database caferj:</w:t>
+        <w:t>ERD di bawah ini memetakan relasi antara 5 entitas tabel basis data MySQL pada database caferj:</w:t>
       </w:r>
     </w:p>
     <w:p>
       <w:pPr>
+        <w:spacing w:before="120" w:after="40"/>
         <w:jc w:val="center"/>
       </w:pPr>
     </w:p>
@@ -2950,7 +2955,7 @@
       <w:r>
         <w:drawing>
           <wp:inline xmlns:a="http://schemas.openxmlformats.org/drawingml/2006/main" xmlns:pic="http://schemas.openxmlformats.org/drawingml/2006/picture">
-            <wp:extent cx="5486400" cy="2346722"/>
+            <wp:extent cx="5303520" cy="2268498"/>
             <wp:docPr id="3" name="Picture 3"/>
             <wp:cNvGraphicFramePr>
               <a:graphicFrameLocks noChangeAspect="1"/>
@@ -2971,7 +2976,7 @@
                   <pic:spPr>
                     <a:xfrm>
                       <a:off x="0" y="0"/>
-                      <a:ext cx="5486400" cy="2346722"/>
+                      <a:ext cx="5303520" cy="2268498"/>
                     </a:xfrm>
                     <a:prstGeom prst="rect"/>
                   </pic:spPr>
@@ -2984,6 +2989,7 @@
     </w:p>
     <w:p>
       <w:pPr>
+        <w:spacing w:after="200"/>
         <w:jc w:val="center"/>
       </w:pPr>
       <w:r>
@@ -2991,7 +2997,7 @@
           <w:rFonts w:ascii="Arial" w:hAnsi="Arial"/>
           <w:b w:val="0"/>
           <w:i/>
-          <w:color w:val="505050"/>
+          <w:color w:val="3C3C3C"/>
           <w:sz w:val="19"/>
         </w:rPr>
         <w:t>Gambar 3.3: Entity Relationship Diagram (ERD) Database caferj</w:t>
@@ -3025,11 +3031,12 @@
           <w:color w:val="000000"/>
           <w:sz w:val="22"/>
         </w:rPr>
-        <w:t>DFD Level 0 berikut memodelkan aliran pertukaran data masukan dan keluaran antara entitas luar (Kasir dan Admin) dengan sistem POS Cafe RJ:</w:t>
+        <w:t>DFD Level 0 berikut memodelkan aliran data masukan dan keluaran antara entitas luar (Kasir dan Admin) dengan sistem POS Cafe RJ:</w:t>
       </w:r>
     </w:p>
     <w:p>
       <w:pPr>
+        <w:spacing w:before="120" w:after="40"/>
         <w:jc w:val="center"/>
       </w:pPr>
     </w:p>
@@ -3037,7 +3044,7 @@
       <w:r>
         <w:drawing>
           <wp:inline xmlns:a="http://schemas.openxmlformats.org/drawingml/2006/main" xmlns:pic="http://schemas.openxmlformats.org/drawingml/2006/picture">
-            <wp:extent cx="5120640" cy="3186176"/>
+            <wp:extent cx="4937760" cy="3072384"/>
             <wp:docPr id="4" name="Picture 4"/>
             <wp:cNvGraphicFramePr>
               <a:graphicFrameLocks noChangeAspect="1"/>
@@ -3058,7 +3065,7 @@
                   <pic:spPr>
                     <a:xfrm>
                       <a:off x="0" y="0"/>
-                      <a:ext cx="5120640" cy="3186176"/>
+                      <a:ext cx="4937760" cy="3072384"/>
                     </a:xfrm>
                     <a:prstGeom prst="rect"/>
                   </pic:spPr>
@@ -3071,6 +3078,7 @@
     </w:p>
     <w:p>
       <w:pPr>
+        <w:spacing w:after="200"/>
         <w:jc w:val="center"/>
       </w:pPr>
       <w:r>
@@ -3078,7 +3086,7 @@
           <w:rFonts w:ascii="Arial" w:hAnsi="Arial"/>
           <w:b w:val="0"/>
           <w:i/>
-          <w:color w:val="505050"/>
+          <w:color w:val="3C3C3C"/>
           <w:sz w:val="19"/>
         </w:rPr>
         <w:t>Gambar 3.4: DFD Konteks Level 0 Sistem POS Cafe RJ</w:t>
@@ -4107,7 +4115,7 @@
           <w:color w:val="000000"/>
           <w:sz w:val="24"/>
         </w:rPr>
-        <w:t>D. Perancangan Antarmuka Pengguna (UI/UX Mockup)</w:t>
+        <w:t>D. Perancangan Mockup / Wireframe (Hitam Putih - Low Fidelity)</w:t>
       </w:r>
     </w:p>
     <w:p>
@@ -4122,7 +4130,7 @@
           <w:color w:val="000000"/>
           <w:sz w:val="22"/>
         </w:rPr>
-        <w:t>Bagian ini menyajikan rancangan antarmuka pengguna (UI/UX) sistem POS Cafe RJ, mencakup terminal kasir utama, panel admin, modal pembayaran QRIS, dan hasil cetak struk.</w:t>
+        <w:t>Bagian ini menyajikan rancangan kerangka kasar dasar antarmuka (wireframe monokrom hitam putih) untuk memetakan tata letak fungsional komponen sebelum diberi desain warna dan styling visual akhir. Tersedia 3 bagian mockup hitam putih:</w:t>
       </w:r>
     </w:p>
     <w:p>
@@ -4138,7 +4146,7 @@
           <w:color w:val="000000"/>
           <w:sz w:val="22"/>
         </w:rPr>
-        <w:t>1. Mockup Terminal Kasir Utama (POS Cashier View)</w:t>
+        <w:t>1. Mockup / Wireframe Hitam Putih 1: Terminal Kasir POS Utama</w:t>
       </w:r>
     </w:p>
     <w:p>
@@ -4153,11 +4161,315 @@
           <w:color w:val="000000"/>
           <w:sz w:val="22"/>
         </w:rPr>
-        <w:t>Tampilan kasir memuat katalog menu berbasis kategori dengan foto produk, keranjang pesanan, dan pilihan metode pembayaran (Tunai, QRIS, Transfer):</w:t>
+        <w:t>Memetakan tata letak bilah kategori menu, susunan grid kartu produk, serta panel keranjang belanja dan tombol checkout:</w:t>
       </w:r>
     </w:p>
     <w:p>
       <w:pPr>
+        <w:spacing w:before="120" w:after="40"/>
+        <w:jc w:val="center"/>
+      </w:pPr>
+    </w:p>
+    <w:p>
+      <w:r>
+        <w:drawing>
+          <wp:inline xmlns:a="http://schemas.openxmlformats.org/drawingml/2006/main" xmlns:pic="http://schemas.openxmlformats.org/drawingml/2006/picture">
+            <wp:extent cx="5303520" cy="3299968"/>
+            <wp:docPr id="5" name="Picture 5"/>
+            <wp:cNvGraphicFramePr>
+              <a:graphicFrameLocks noChangeAspect="1"/>
+            </wp:cNvGraphicFramePr>
+            <a:graphic>
+              <a:graphicData uri="http://schemas.openxmlformats.org/drawingml/2006/picture">
+                <pic:pic>
+                  <pic:nvPicPr>
+                    <pic:cNvPr id="0" name="wireframe_kasir_pos.png"/>
+                    <pic:cNvPicPr/>
+                  </pic:nvPicPr>
+                  <pic:blipFill>
+                    <a:blip r:embed="rId13"/>
+                    <a:stretch>
+                      <a:fillRect/>
+                    </a:stretch>
+                  </pic:blipFill>
+                  <pic:spPr>
+                    <a:xfrm>
+                      <a:off x="0" y="0"/>
+                      <a:ext cx="5303520" cy="3299968"/>
+                    </a:xfrm>
+                    <a:prstGeom prst="rect"/>
+                  </pic:spPr>
+                </pic:pic>
+              </a:graphicData>
+            </a:graphic>
+          </wp:inline>
+        </w:drawing>
+      </w:r>
+    </w:p>
+    <w:p>
+      <w:pPr>
+        <w:spacing w:after="200"/>
+        <w:jc w:val="center"/>
+      </w:pPr>
+      <w:r>
+        <w:rPr>
+          <w:rFonts w:ascii="Arial" w:hAnsi="Arial"/>
+          <w:b w:val="0"/>
+          <w:i/>
+          <w:color w:val="3C3C3C"/>
+          <w:sz w:val="19"/>
+        </w:rPr>
+        <w:t>Gambar 3.5: Wireframe Hitam Putih - Terminal Kasir POS Utama</w:t>
+      </w:r>
+    </w:p>
+    <w:p>
+      <w:pPr>
+        <w:keepNext/>
+        <w:spacing w:before="160" w:after="60"/>
+      </w:pPr>
+      <w:r>
+        <w:rPr>
+          <w:rFonts w:ascii="Arial" w:hAnsi="Arial"/>
+          <w:b/>
+          <w:i w:val="0"/>
+          <w:color w:val="000000"/>
+          <w:sz w:val="22"/>
+        </w:rPr>
+        <w:t>2. Mockup / Wireframe Hitam Putih 2: Panel Administrator dan Master Data</w:t>
+      </w:r>
+    </w:p>
+    <w:p>
+      <w:pPr>
+        <w:spacing w:after="80" w:line="276" w:lineRule="auto"/>
+      </w:pPr>
+      <w:r>
+        <w:rPr>
+          <w:rFonts w:ascii="Arial" w:hAnsi="Arial"/>
+          <w:b w:val="0"/>
+          <w:i w:val="0"/>
+          <w:color w:val="000000"/>
+          <w:sz w:val="22"/>
+        </w:rPr>
+        <w:t>Memetakan tata letak sidebar menu admin, 4 kartu ringkasan omzet, serta tabel master data produk cafe:</w:t>
+      </w:r>
+    </w:p>
+    <w:p>
+      <w:pPr>
+        <w:spacing w:before="120" w:after="40"/>
+        <w:jc w:val="center"/>
+      </w:pPr>
+    </w:p>
+    <w:p>
+      <w:r>
+        <w:drawing>
+          <wp:inline xmlns:a="http://schemas.openxmlformats.org/drawingml/2006/main" xmlns:pic="http://schemas.openxmlformats.org/drawingml/2006/picture">
+            <wp:extent cx="5303520" cy="3299968"/>
+            <wp:docPr id="6" name="Picture 6"/>
+            <wp:cNvGraphicFramePr>
+              <a:graphicFrameLocks noChangeAspect="1"/>
+            </wp:cNvGraphicFramePr>
+            <a:graphic>
+              <a:graphicData uri="http://schemas.openxmlformats.org/drawingml/2006/picture">
+                <pic:pic>
+                  <pic:nvPicPr>
+                    <pic:cNvPr id="0" name="wireframe_admin_dashboard.png"/>
+                    <pic:cNvPicPr/>
+                  </pic:nvPicPr>
+                  <pic:blipFill>
+                    <a:blip r:embed="rId14"/>
+                    <a:stretch>
+                      <a:fillRect/>
+                    </a:stretch>
+                  </pic:blipFill>
+                  <pic:spPr>
+                    <a:xfrm>
+                      <a:off x="0" y="0"/>
+                      <a:ext cx="5303520" cy="3299968"/>
+                    </a:xfrm>
+                    <a:prstGeom prst="rect"/>
+                  </pic:spPr>
+                </pic:pic>
+              </a:graphicData>
+            </a:graphic>
+          </wp:inline>
+        </w:drawing>
+      </w:r>
+    </w:p>
+    <w:p>
+      <w:pPr>
+        <w:spacing w:after="200"/>
+        <w:jc w:val="center"/>
+      </w:pPr>
+      <w:r>
+        <w:rPr>
+          <w:rFonts w:ascii="Arial" w:hAnsi="Arial"/>
+          <w:b w:val="0"/>
+          <w:i/>
+          <w:color w:val="3C3C3C"/>
+          <w:sz w:val="19"/>
+        </w:rPr>
+        <w:t>Gambar 3.6: Wireframe Hitam Putih - Panel Admin &amp; Master Data</w:t>
+      </w:r>
+    </w:p>
+    <w:p>
+      <w:pPr>
+        <w:keepNext/>
+        <w:spacing w:before="160" w:after="60"/>
+      </w:pPr>
+      <w:r>
+        <w:rPr>
+          <w:rFonts w:ascii="Arial" w:hAnsi="Arial"/>
+          <w:b/>
+          <w:i w:val="0"/>
+          <w:color w:val="000000"/>
+          <w:sz w:val="22"/>
+        </w:rPr>
+        <w:t>3. Mockup / Wireframe Hitam Putih 3: Modal Pembayaran QRIS Pelanggan</w:t>
+      </w:r>
+    </w:p>
+    <w:p>
+      <w:pPr>
+        <w:spacing w:after="80" w:line="276" w:lineRule="auto"/>
+      </w:pPr>
+      <w:r>
+        <w:rPr>
+          <w:rFonts w:ascii="Arial" w:hAnsi="Arial"/>
+          <w:b w:val="0"/>
+          <w:i w:val="0"/>
+          <w:color w:val="000000"/>
+          <w:sz w:val="22"/>
+        </w:rPr>
+        <w:t>Memetakan tata letak kotak dialog pembesar kode barcode QRIS agar pelanggan mudah memindai pembayaran:</w:t>
+      </w:r>
+    </w:p>
+    <w:p>
+      <w:pPr>
+        <w:spacing w:before="120" w:after="40"/>
+        <w:jc w:val="center"/>
+      </w:pPr>
+    </w:p>
+    <w:p>
+      <w:r>
+        <w:drawing>
+          <wp:inline xmlns:a="http://schemas.openxmlformats.org/drawingml/2006/main" xmlns:pic="http://schemas.openxmlformats.org/drawingml/2006/picture">
+            <wp:extent cx="4937760" cy="3072384"/>
+            <wp:docPr id="7" name="Picture 7"/>
+            <wp:cNvGraphicFramePr>
+              <a:graphicFrameLocks noChangeAspect="1"/>
+            </wp:cNvGraphicFramePr>
+            <a:graphic>
+              <a:graphicData uri="http://schemas.openxmlformats.org/drawingml/2006/picture">
+                <pic:pic>
+                  <pic:nvPicPr>
+                    <pic:cNvPr id="0" name="wireframe_pembayaran_qris.png"/>
+                    <pic:cNvPicPr/>
+                  </pic:nvPicPr>
+                  <pic:blipFill>
+                    <a:blip r:embed="rId15"/>
+                    <a:stretch>
+                      <a:fillRect/>
+                    </a:stretch>
+                  </pic:blipFill>
+                  <pic:spPr>
+                    <a:xfrm>
+                      <a:off x="0" y="0"/>
+                      <a:ext cx="4937760" cy="3072384"/>
+                    </a:xfrm>
+                    <a:prstGeom prst="rect"/>
+                  </pic:spPr>
+                </pic:pic>
+              </a:graphicData>
+            </a:graphic>
+          </wp:inline>
+        </w:drawing>
+      </w:r>
+    </w:p>
+    <w:p>
+      <w:pPr>
+        <w:spacing w:after="200"/>
+        <w:jc w:val="center"/>
+      </w:pPr>
+      <w:r>
+        <w:rPr>
+          <w:rFonts w:ascii="Arial" w:hAnsi="Arial"/>
+          <w:b w:val="0"/>
+          <w:i/>
+          <w:color w:val="3C3C3C"/>
+          <w:sz w:val="19"/>
+        </w:rPr>
+        <w:t>Gambar 3.7: Wireframe Hitam Putih - Modal Pembayaran QRIS Pelanggan</w:t>
+      </w:r>
+    </w:p>
+    <w:p>
+      <w:r>
+        <w:br w:type="page"/>
+      </w:r>
+    </w:p>
+    <w:p>
+      <w:pPr>
+        <w:keepNext/>
+        <w:spacing w:before="200" w:after="80"/>
+      </w:pPr>
+      <w:r>
+        <w:rPr>
+          <w:rFonts w:ascii="Arial" w:hAnsi="Arial"/>
+          <w:b/>
+          <w:i w:val="0"/>
+          <w:color w:val="000000"/>
+          <w:sz w:val="24"/>
+        </w:rPr>
+        <w:t>E. Perancangan UI/UX &amp; Hasil Tampilan Web (Full Color - High Fidelity)</w:t>
+      </w:r>
+    </w:p>
+    <w:p>
+      <w:pPr>
+        <w:spacing w:after="80" w:line="276" w:lineRule="auto"/>
+      </w:pPr>
+      <w:r>
+        <w:rPr>
+          <w:rFonts w:ascii="Arial" w:hAnsi="Arial"/>
+          <w:b w:val="0"/>
+          <w:i w:val="0"/>
+          <w:color w:val="000000"/>
+          <w:sz w:val="22"/>
+        </w:rPr>
+        <w:t>Bagian ini menyajikan hasil implementasi antarmuka pengguna (UI/UX) akhir yang sudah berwarna penuh (full color), berfoto produk asli, dan aktif beroperasi pada sistem web Cafe RJ POS. Tersedia 3 bagian tampilan UI/UX web:</w:t>
+      </w:r>
+    </w:p>
+    <w:p>
+      <w:pPr>
+        <w:keepNext/>
+        <w:spacing w:before="160" w:after="60"/>
+      </w:pPr>
+      <w:r>
+        <w:rPr>
+          <w:rFonts w:ascii="Arial" w:hAnsi="Arial"/>
+          <w:b/>
+          <w:i w:val="0"/>
+          <w:color w:val="000000"/>
+          <w:sz w:val="22"/>
+        </w:rPr>
+        <w:t>1. UI/UX Hasil Tampilan Web 1: Terminal Kasir POS Aktif</w:t>
+      </w:r>
+    </w:p>
+    <w:p>
+      <w:pPr>
+        <w:spacing w:after="80" w:line="276" w:lineRule="auto"/>
+      </w:pPr>
+      <w:r>
+        <w:rPr>
+          <w:rFonts w:ascii="Arial" w:hAnsi="Arial"/>
+          <w:b w:val="0"/>
+          <w:i w:val="0"/>
+          <w:color w:val="000000"/>
+          <w:sz w:val="22"/>
+        </w:rPr>
+        <w:t>Tampilan kasir aktif di browser web dengan nuansa gelap (dark zinc), katalog foto menu berharga IDR, stepper keranjang, dan tab pembayaran multi-metode:</w:t>
+      </w:r>
+    </w:p>
+    <w:p>
+      <w:pPr>
+        <w:spacing w:before="120" w:after="40"/>
         <w:jc w:val="center"/>
       </w:pPr>
     </w:p>
@@ -4166,7 +4478,7 @@
         <w:drawing>
           <wp:inline xmlns:a="http://schemas.openxmlformats.org/drawingml/2006/main" xmlns:pic="http://schemas.openxmlformats.org/drawingml/2006/picture">
             <wp:extent cx="5303520" cy="2960104"/>
-            <wp:docPr id="5" name="Picture 5"/>
+            <wp:docPr id="8" name="Picture 8"/>
             <wp:cNvGraphicFramePr>
               <a:graphicFrameLocks noChangeAspect="1"/>
             </wp:cNvGraphicFramePr>
@@ -4178,7 +4490,7 @@
                     <pic:cNvPicPr/>
                   </pic:nvPicPr>
                   <pic:blipFill>
-                    <a:blip r:embed="rId13"/>
+                    <a:blip r:embed="rId16"/>
                     <a:stretch>
                       <a:fillRect/>
                     </a:stretch>
@@ -4199,6 +4511,7 @@
     </w:p>
     <w:p>
       <w:pPr>
+        <w:spacing w:after="200"/>
         <w:jc w:val="center"/>
       </w:pPr>
       <w:r>
@@ -4206,10 +4519,10 @@
           <w:rFonts w:ascii="Arial" w:hAnsi="Arial"/>
           <w:b w:val="0"/>
           <w:i/>
-          <w:color w:val="505050"/>
+          <w:color w:val="3C3C3C"/>
           <w:sz w:val="19"/>
         </w:rPr>
-        <w:t>Gambar 3.5: Mockup Antarmuka Terminal Kasir Utama (Cafe RJ POS)</w:t>
+        <w:t>Gambar 3.8: UI/UX Tampilan Web 1 - Terminal Kasir POS Aktif (Full Color)</w:t>
       </w:r>
     </w:p>
     <w:p>
@@ -4225,7 +4538,7 @@
           <w:color w:val="000000"/>
           <w:sz w:val="22"/>
         </w:rPr>
-        <w:t>2. Mockup Dashboard dan Master Menu (Admin View)</w:t>
+        <w:t>2. UI/UX Hasil Tampilan Web 2: Dashboard &amp; Manajemen Produk Admin</w:t>
       </w:r>
     </w:p>
     <w:p>
@@ -4240,11 +4553,12 @@
           <w:color w:val="000000"/>
           <w:sz w:val="22"/>
         </w:rPr>
-        <w:t>Tampilan panel admin memuat kartu metrik omzet penjualan dan tabel CRUD data produk menu cafe:</w:t>
+        <w:t>Tampilan panel admin aktif di browser web dengan metrik penjualan real-time serta tabel CRUD master menu lengkap dengan thumbnail gambar:</w:t>
       </w:r>
     </w:p>
     <w:p>
       <w:pPr>
+        <w:spacing w:before="120" w:after="40"/>
         <w:jc w:val="center"/>
       </w:pPr>
     </w:p>
@@ -4253,7 +4567,7 @@
         <w:drawing>
           <wp:inline xmlns:a="http://schemas.openxmlformats.org/drawingml/2006/main" xmlns:pic="http://schemas.openxmlformats.org/drawingml/2006/picture">
             <wp:extent cx="5303520" cy="2960104"/>
-            <wp:docPr id="6" name="Picture 6"/>
+            <wp:docPr id="9" name="Picture 9"/>
             <wp:cNvGraphicFramePr>
               <a:graphicFrameLocks noChangeAspect="1"/>
             </wp:cNvGraphicFramePr>
@@ -4265,7 +4579,7 @@
                     <pic:cNvPicPr/>
                   </pic:nvPicPr>
                   <pic:blipFill>
-                    <a:blip r:embed="rId14"/>
+                    <a:blip r:embed="rId17"/>
                     <a:stretch>
                       <a:fillRect/>
                     </a:stretch>
@@ -4286,6 +4600,7 @@
     </w:p>
     <w:p>
       <w:pPr>
+        <w:spacing w:after="200"/>
         <w:jc w:val="center"/>
       </w:pPr>
       <w:r>
@@ -4293,10 +4608,10 @@
           <w:rFonts w:ascii="Arial" w:hAnsi="Arial"/>
           <w:b w:val="0"/>
           <w:i/>
-          <w:color w:val="505050"/>
+          <w:color w:val="3C3C3C"/>
           <w:sz w:val="19"/>
         </w:rPr>
-        <w:t>Gambar 3.6: Mockup Antarmuka Panel Admin dan Manajemen Menu</w:t>
+        <w:t>Gambar 3.9: UI/UX Tampilan Web 2 - Dashboard &amp; Manajemen Menu Admin (Full Color)</w:t>
       </w:r>
     </w:p>
     <w:p>
@@ -4312,7 +4627,7 @@
           <w:color w:val="000000"/>
           <w:sz w:val="22"/>
         </w:rPr>
-        <w:t>3. Mockup Tampilan Modal QRIS (Layar Pelanggan)</w:t>
+        <w:t>3. UI/UX Hasil Tampilan Web 3: Format Cetak Struk Belanja &amp; Bukti Lunas</w:t>
       </w:r>
     </w:p>
     <w:p>
@@ -4327,7 +4642,7 @@
           <w:color w:val="000000"/>
           <w:sz w:val="22"/>
         </w:rPr>
-        <w:t>Kolom berikut disediakan bagi Anda untuk menempelkan tangkapan layar modal QRIS yang diperbesar:</w:t>
+        <w:t>Tampilan dokumen bukti transaksi sah hasil cetak sistem kasir (mode Faktur Layar Penuh A4 atau Struk Mini Thermal 80mm). Kolom berikut disediakan bagi Anda untuk menempelkan hasil cetak struk dari browser kasir:</w:t>
       </w:r>
     </w:p>
     <w:tbl>
@@ -4348,7 +4663,7 @@
           </w:tcPr>
           <w:p>
             <w:pPr>
-              <w:spacing w:before="600" w:after="600"/>
+              <w:spacing w:before="720" w:after="720"/>
               <w:jc w:val="center"/>
             </w:pPr>
             <w:r>
@@ -4359,9 +4674,9 @@
                 <w:color w:val="646464"/>
                 <w:sz w:val="20"/>
               </w:rPr>
-              <w:t>[ TEMPELKAN SCREENSHOT TAMPILAN MODAL QRIS PELANGGAN DI SINI ]</w:t>
+              <w:t>[ TEMPELKAN SCREENSHOT CETAK STRUK BELANJA DI SINI ]</w:t>
               <w:br/>
-              <w:t>(Klik di dalam kotak ini lalu Paste gambar / Insert Picture)</w:t>
+              <w:t>(Klik di dalam kotak lalu Paste gambar / Insert Picture)</w:t>
             </w:r>
           </w:p>
         </w:tc>
@@ -4369,6 +4684,7 @@
     </w:tbl>
     <w:p>
       <w:pPr>
+        <w:spacing w:after="200"/>
         <w:jc w:val="center"/>
       </w:pPr>
       <w:r>
@@ -4376,93 +4692,10 @@
           <w:rFonts w:ascii="Arial" w:hAnsi="Arial"/>
           <w:b w:val="0"/>
           <w:i/>
-          <w:color w:val="505050"/>
+          <w:color w:val="3C3C3C"/>
           <w:sz w:val="19"/>
         </w:rPr>
-        <w:t>Gambar 3.7: Tampilan Modal Perbesar QRIS Pelanggan</w:t>
-      </w:r>
-    </w:p>
-    <w:p>
-      <w:pPr>
-        <w:keepNext/>
-        <w:spacing w:before="160" w:after="60"/>
-      </w:pPr>
-      <w:r>
-        <w:rPr>
-          <w:rFonts w:ascii="Arial" w:hAnsi="Arial"/>
-          <w:b/>
-          <w:i w:val="0"/>
-          <w:color w:val="000000"/>
-          <w:sz w:val="22"/>
-        </w:rPr>
-        <w:t>4. Mockup Tampilan Cetak Struk Belanja (Receipt)</w:t>
-      </w:r>
-    </w:p>
-    <w:p>
-      <w:pPr>
-        <w:spacing w:after="80" w:line="276" w:lineRule="auto"/>
-      </w:pPr>
-      <w:r>
-        <w:rPr>
-          <w:rFonts w:ascii="Arial" w:hAnsi="Arial"/>
-          <w:b w:val="0"/>
-          <w:i w:val="0"/>
-          <w:color w:val="000000"/>
-          <w:sz w:val="22"/>
-        </w:rPr>
-        <w:t>Kolom berikut disediakan bagi Anda untuk menempelkan tangkapan layar hasil cetak struk belanja:</w:t>
-      </w:r>
-    </w:p>
-    <w:tbl>
-      <w:tblPr>
-        <w:tblW w:type="auto" w:w="0"/>
-        <w:jc w:val="center"/>
-        <w:tblLook w:firstColumn="1" w:firstRow="1" w:lastColumn="0" w:lastRow="0" w:noHBand="0" w:noVBand="1" w:val="04A0"/>
-      </w:tblPr>
-      <w:tblGrid>
-        <w:gridCol w:w="9360"/>
-      </w:tblGrid>
-      <w:tr>
-        <w:tc>
-          <w:tcPr>
-            <w:tcW w:type="dxa" w:w="8352"/>
-            <w:tcBorders w:top="single" w:top-val="single" w:top-sz="4" w:top-space="0" w:top-color="CCCCCC" w:left="single" w:left-val="single" w:left-sz="4" w:left-space="0" w:left-color="CCCCCC" w:bottom="single" w:bottom-val="single" w:bottom-sz="4" w:bottom-space="0" w:bottom-color="CCCCCC" w:right="single" w:right-val="single" w:right-sz="4" w:right-space="0" w:right-color="CCCCCC"/>
-            <w:shd w:fill="FAFAFA"/>
-          </w:tcPr>
-          <w:p>
-            <w:pPr>
-              <w:spacing w:before="600" w:after="600"/>
-              <w:jc w:val="center"/>
-            </w:pPr>
-            <w:r>
-              <w:rPr>
-                <w:rFonts w:ascii="Arial" w:hAnsi="Arial"/>
-                <w:b/>
-                <w:i w:val="0"/>
-                <w:color w:val="646464"/>
-                <w:sz w:val="20"/>
-              </w:rPr>
-              <w:t>[ TEMPELKAN SCREENSHOT HASIL CETAK STRUK BELANJA DI SINI ]</w:t>
-              <w:br/>
-              <w:t>(Klik di dalam kotak ini lalu Paste gambar / Insert Picture)</w:t>
-            </w:r>
-          </w:p>
-        </w:tc>
-      </w:tr>
-    </w:tbl>
-    <w:p>
-      <w:pPr>
-        <w:jc w:val="center"/>
-      </w:pPr>
-      <w:r>
-        <w:rPr>
-          <w:rFonts w:ascii="Arial" w:hAnsi="Arial"/>
-          <w:b w:val="0"/>
-          <w:i/>
-          <w:color w:val="505050"/>
-          <w:sz w:val="19"/>
-        </w:rPr>
-        <w:t>Gambar 3.8: Tampilan Hasil Cetak Struk Pembelian (Faktur/Thermal)</w:t>
+        <w:t>Gambar 3.10: UI/UX Tampilan Web 3 - Hasil Cetak Struk Belanja Transaksi</w:t>
       </w:r>
     </w:p>
     <w:p>

</xml_diff>

<commit_message>
update srs docx with login mockups
</commit_message>
<xml_diff>
--- a/SRS_Cafe_RJ.docx
+++ b/SRS_Cafe_RJ.docx
@@ -4130,7 +4130,7 @@
           <w:color w:val="000000"/>
           <w:sz w:val="22"/>
         </w:rPr>
-        <w:t>Bagian ini menyajikan rancangan kerangka kasar dasar antarmuka (wireframe monokrom hitam putih) untuk memetakan tata letak fungsional komponen sebelum diberi desain warna dan styling visual akhir. Tersedia 3 bagian mockup hitam putih:</w:t>
+        <w:t>Bagian ini menyajikan rancangan kerangka kasar dasar antarmuka (wireframe monokrom hitam putih) untuk memetakan tata letak fungsional komponen sebelum diberi desain warna dan styling visual akhir. Terdapat 3 gambar mockup hitam putih:</w:t>
       </w:r>
     </w:p>
     <w:p>
@@ -4146,7 +4146,96 @@
           <w:color w:val="000000"/>
           <w:sz w:val="22"/>
         </w:rPr>
-        <w:t>1. Mockup / Wireframe Hitam Putih 1: Terminal Kasir POS Utama</w:t>
+        <w:t>1. Mockup / Wireframe Hitam Putih 1: Halaman Login Pengguna</w:t>
+      </w:r>
+    </w:p>
+    <w:p>
+      <w:pPr>
+        <w:spacing w:after="80" w:line="276" w:lineRule="auto"/>
+      </w:pPr>
+      <w:r>
+        <w:rPr>
+          <w:rFonts w:ascii="Arial" w:hAnsi="Arial"/>
+          <w:b w:val="0"/>
+          <w:i w:val="0"/>
+          <w:color w:val="000000"/>
+          <w:sz w:val="22"/>
+        </w:rPr>
+        <w:t>Memetakan tata letak kotak formulir autentikasi akun kasir dan admin (input email, password, dan tombol masuk):</w:t>
+      </w:r>
+    </w:p>
+    <w:p>
+      <w:pPr>
+        <w:spacing w:before="120" w:after="40"/>
+        <w:jc w:val="center"/>
+      </w:pPr>
+    </w:p>
+    <w:p>
+      <w:r>
+        <w:drawing>
+          <wp:inline xmlns:a="http://schemas.openxmlformats.org/drawingml/2006/main" xmlns:pic="http://schemas.openxmlformats.org/drawingml/2006/picture">
+            <wp:extent cx="4937760" cy="3072384"/>
+            <wp:docPr id="5" name="Picture 5"/>
+            <wp:cNvGraphicFramePr>
+              <a:graphicFrameLocks noChangeAspect="1"/>
+            </wp:cNvGraphicFramePr>
+            <a:graphic>
+              <a:graphicData uri="http://schemas.openxmlformats.org/drawingml/2006/picture">
+                <pic:pic>
+                  <pic:nvPicPr>
+                    <pic:cNvPr id="0" name="wireframe_login.png"/>
+                    <pic:cNvPicPr/>
+                  </pic:nvPicPr>
+                  <pic:blipFill>
+                    <a:blip r:embed="rId13"/>
+                    <a:stretch>
+                      <a:fillRect/>
+                    </a:stretch>
+                  </pic:blipFill>
+                  <pic:spPr>
+                    <a:xfrm>
+                      <a:off x="0" y="0"/>
+                      <a:ext cx="4937760" cy="3072384"/>
+                    </a:xfrm>
+                    <a:prstGeom prst="rect"/>
+                  </pic:spPr>
+                </pic:pic>
+              </a:graphicData>
+            </a:graphic>
+          </wp:inline>
+        </w:drawing>
+      </w:r>
+    </w:p>
+    <w:p>
+      <w:pPr>
+        <w:spacing w:after="200"/>
+        <w:jc w:val="center"/>
+      </w:pPr>
+      <w:r>
+        <w:rPr>
+          <w:rFonts w:ascii="Arial" w:hAnsi="Arial"/>
+          <w:b w:val="0"/>
+          <w:i/>
+          <w:color w:val="3C3C3C"/>
+          <w:sz w:val="19"/>
+        </w:rPr>
+        <w:t>Gambar 3.5: Wireframe Hitam Putih 1 - Halaman Login Pengguna</w:t>
+      </w:r>
+    </w:p>
+    <w:p>
+      <w:pPr>
+        <w:keepNext/>
+        <w:spacing w:before="160" w:after="60"/>
+      </w:pPr>
+      <w:r>
+        <w:rPr>
+          <w:rFonts w:ascii="Arial" w:hAnsi="Arial"/>
+          <w:b/>
+          <w:i w:val="0"/>
+          <w:color w:val="000000"/>
+          <w:sz w:val="22"/>
+        </w:rPr>
+        <w:t>2. Mockup / Wireframe Hitam Putih 2: Terminal Kasir POS Utama</w:t>
       </w:r>
     </w:p>
     <w:p>
@@ -4175,7 +4264,7 @@
         <w:drawing>
           <wp:inline xmlns:a="http://schemas.openxmlformats.org/drawingml/2006/main" xmlns:pic="http://schemas.openxmlformats.org/drawingml/2006/picture">
             <wp:extent cx="5303520" cy="3299968"/>
-            <wp:docPr id="5" name="Picture 5"/>
+            <wp:docPr id="6" name="Picture 6"/>
             <wp:cNvGraphicFramePr>
               <a:graphicFrameLocks noChangeAspect="1"/>
             </wp:cNvGraphicFramePr>
@@ -4184,95 +4273,6 @@
                 <pic:pic>
                   <pic:nvPicPr>
                     <pic:cNvPr id="0" name="wireframe_kasir_pos.png"/>
-                    <pic:cNvPicPr/>
-                  </pic:nvPicPr>
-                  <pic:blipFill>
-                    <a:blip r:embed="rId13"/>
-                    <a:stretch>
-                      <a:fillRect/>
-                    </a:stretch>
-                  </pic:blipFill>
-                  <pic:spPr>
-                    <a:xfrm>
-                      <a:off x="0" y="0"/>
-                      <a:ext cx="5303520" cy="3299968"/>
-                    </a:xfrm>
-                    <a:prstGeom prst="rect"/>
-                  </pic:spPr>
-                </pic:pic>
-              </a:graphicData>
-            </a:graphic>
-          </wp:inline>
-        </w:drawing>
-      </w:r>
-    </w:p>
-    <w:p>
-      <w:pPr>
-        <w:spacing w:after="200"/>
-        <w:jc w:val="center"/>
-      </w:pPr>
-      <w:r>
-        <w:rPr>
-          <w:rFonts w:ascii="Arial" w:hAnsi="Arial"/>
-          <w:b w:val="0"/>
-          <w:i/>
-          <w:color w:val="3C3C3C"/>
-          <w:sz w:val="19"/>
-        </w:rPr>
-        <w:t>Gambar 3.5: Wireframe Hitam Putih - Terminal Kasir POS Utama</w:t>
-      </w:r>
-    </w:p>
-    <w:p>
-      <w:pPr>
-        <w:keepNext/>
-        <w:spacing w:before="160" w:after="60"/>
-      </w:pPr>
-      <w:r>
-        <w:rPr>
-          <w:rFonts w:ascii="Arial" w:hAnsi="Arial"/>
-          <w:b/>
-          <w:i w:val="0"/>
-          <w:color w:val="000000"/>
-          <w:sz w:val="22"/>
-        </w:rPr>
-        <w:t>2. Mockup / Wireframe Hitam Putih 2: Panel Administrator dan Master Data</w:t>
-      </w:r>
-    </w:p>
-    <w:p>
-      <w:pPr>
-        <w:spacing w:after="80" w:line="276" w:lineRule="auto"/>
-      </w:pPr>
-      <w:r>
-        <w:rPr>
-          <w:rFonts w:ascii="Arial" w:hAnsi="Arial"/>
-          <w:b w:val="0"/>
-          <w:i w:val="0"/>
-          <w:color w:val="000000"/>
-          <w:sz w:val="22"/>
-        </w:rPr>
-        <w:t>Memetakan tata letak sidebar menu admin, 4 kartu ringkasan omzet, serta tabel master data produk cafe:</w:t>
-      </w:r>
-    </w:p>
-    <w:p>
-      <w:pPr>
-        <w:spacing w:before="120" w:after="40"/>
-        <w:jc w:val="center"/>
-      </w:pPr>
-    </w:p>
-    <w:p>
-      <w:r>
-        <w:drawing>
-          <wp:inline xmlns:a="http://schemas.openxmlformats.org/drawingml/2006/main" xmlns:pic="http://schemas.openxmlformats.org/drawingml/2006/picture">
-            <wp:extent cx="5303520" cy="3299968"/>
-            <wp:docPr id="6" name="Picture 6"/>
-            <wp:cNvGraphicFramePr>
-              <a:graphicFrameLocks noChangeAspect="1"/>
-            </wp:cNvGraphicFramePr>
-            <a:graphic>
-              <a:graphicData uri="http://schemas.openxmlformats.org/drawingml/2006/picture">
-                <pic:pic>
-                  <pic:nvPicPr>
-                    <pic:cNvPr id="0" name="wireframe_admin_dashboard.png"/>
                     <pic:cNvPicPr/>
                   </pic:nvPicPr>
                   <pic:blipFill>
@@ -4308,7 +4308,7 @@
           <w:color w:val="3C3C3C"/>
           <w:sz w:val="19"/>
         </w:rPr>
-        <w:t>Gambar 3.6: Wireframe Hitam Putih - Panel Admin &amp; Master Data</w:t>
+        <w:t>Gambar 3.6: Wireframe Hitam Putih 2 - Terminal Kasir POS Utama</w:t>
       </w:r>
     </w:p>
     <w:p>
@@ -4324,7 +4324,7 @@
           <w:color w:val="000000"/>
           <w:sz w:val="22"/>
         </w:rPr>
-        <w:t>3. Mockup / Wireframe Hitam Putih 3: Modal Pembayaran QRIS Pelanggan</w:t>
+        <w:t>3. Mockup / Wireframe Hitam Putih 3: Panel Administrator dan Master Data</w:t>
       </w:r>
     </w:p>
     <w:p>
@@ -4339,7 +4339,7 @@
           <w:color w:val="000000"/>
           <w:sz w:val="22"/>
         </w:rPr>
-        <w:t>Memetakan tata letak kotak dialog pembesar kode barcode QRIS agar pelanggan mudah memindai pembayaran:</w:t>
+        <w:t>Memetakan tata letak sidebar menu admin, 4 kartu ringkasan omzet, serta tabel master data produk cafe:</w:t>
       </w:r>
     </w:p>
     <w:p>
@@ -4352,7 +4352,7 @@
       <w:r>
         <w:drawing>
           <wp:inline xmlns:a="http://schemas.openxmlformats.org/drawingml/2006/main" xmlns:pic="http://schemas.openxmlformats.org/drawingml/2006/picture">
-            <wp:extent cx="4937760" cy="3072384"/>
+            <wp:extent cx="5303520" cy="3299968"/>
             <wp:docPr id="7" name="Picture 7"/>
             <wp:cNvGraphicFramePr>
               <a:graphicFrameLocks noChangeAspect="1"/>
@@ -4361,7 +4361,7 @@
               <a:graphicData uri="http://schemas.openxmlformats.org/drawingml/2006/picture">
                 <pic:pic>
                   <pic:nvPicPr>
-                    <pic:cNvPr id="0" name="wireframe_pembayaran_qris.png"/>
+                    <pic:cNvPr id="0" name="wireframe_admin_dashboard.png"/>
                     <pic:cNvPicPr/>
                   </pic:nvPicPr>
                   <pic:blipFill>
@@ -4373,7 +4373,7 @@
                   <pic:spPr>
                     <a:xfrm>
                       <a:off x="0" y="0"/>
-                      <a:ext cx="4937760" cy="3072384"/>
+                      <a:ext cx="5303520" cy="3299968"/>
                     </a:xfrm>
                     <a:prstGeom prst="rect"/>
                   </pic:spPr>
@@ -4397,7 +4397,7 @@
           <w:color w:val="3C3C3C"/>
           <w:sz w:val="19"/>
         </w:rPr>
-        <w:t>Gambar 3.7: Wireframe Hitam Putih - Modal Pembayaran QRIS Pelanggan</w:t>
+        <w:t>Gambar 3.7: Wireframe Hitam Putih 3 - Panel Administrator &amp; Master Data</w:t>
       </w:r>
     </w:p>
     <w:p>
@@ -4433,7 +4433,7 @@
           <w:color w:val="000000"/>
           <w:sz w:val="22"/>
         </w:rPr>
-        <w:t>Bagian ini menyajikan hasil implementasi antarmuka pengguna (UI/UX) akhir yang sudah berwarna penuh (full color), berfoto produk asli, dan aktif beroperasi pada sistem web Cafe RJ POS. Tersedia 3 bagian tampilan UI/UX web:</w:t>
+        <w:t>Bagian ini menyajikan hasil implementasi antarmuka pengguna (UI/UX) akhir yang sudah berwarna penuh (full color), berfoto produk asli, dan aktif beroperasi pada sistem web Cafe RJ POS. Terdapat 3 gambar tampilan UI/UX web:</w:t>
       </w:r>
     </w:p>
     <w:p>
@@ -4449,7 +4449,96 @@
           <w:color w:val="000000"/>
           <w:sz w:val="22"/>
         </w:rPr>
-        <w:t>1. UI/UX Hasil Tampilan Web 1: Terminal Kasir POS Aktif</w:t>
+        <w:t>1. UI/UX Hasil Tampilan Web 1: Halaman Login Sistem POS</w:t>
+      </w:r>
+    </w:p>
+    <w:p>
+      <w:pPr>
+        <w:spacing w:after="80" w:line="276" w:lineRule="auto"/>
+      </w:pPr>
+      <w:r>
+        <w:rPr>
+          <w:rFonts w:ascii="Arial" w:hAnsi="Arial"/>
+          <w:b w:val="0"/>
+          <w:i w:val="0"/>
+          <w:color w:val="000000"/>
+          <w:sz w:val="22"/>
+        </w:rPr>
+        <w:t>Tampilan antarmuka login aktif di browser web dengan kartu terpusat, logo Cafe RJ, dan form autentikasi multi-role:</w:t>
+      </w:r>
+    </w:p>
+    <w:p>
+      <w:pPr>
+        <w:spacing w:before="120" w:after="40"/>
+        <w:jc w:val="center"/>
+      </w:pPr>
+    </w:p>
+    <w:p>
+      <w:r>
+        <w:drawing>
+          <wp:inline xmlns:a="http://schemas.openxmlformats.org/drawingml/2006/main" xmlns:pic="http://schemas.openxmlformats.org/drawingml/2006/picture">
+            <wp:extent cx="4937760" cy="2338685"/>
+            <wp:docPr id="8" name="Picture 8"/>
+            <wp:cNvGraphicFramePr>
+              <a:graphicFrameLocks noChangeAspect="1"/>
+            </wp:cNvGraphicFramePr>
+            <a:graphic>
+              <a:graphicData uri="http://schemas.openxmlformats.org/drawingml/2006/picture">
+                <pic:pic>
+                  <pic:nvPicPr>
+                    <pic:cNvPr id="0" name="login_web_screen.png"/>
+                    <pic:cNvPicPr/>
+                  </pic:nvPicPr>
+                  <pic:blipFill>
+                    <a:blip r:embed="rId16"/>
+                    <a:stretch>
+                      <a:fillRect/>
+                    </a:stretch>
+                  </pic:blipFill>
+                  <pic:spPr>
+                    <a:xfrm>
+                      <a:off x="0" y="0"/>
+                      <a:ext cx="4937760" cy="2338685"/>
+                    </a:xfrm>
+                    <a:prstGeom prst="rect"/>
+                  </pic:spPr>
+                </pic:pic>
+              </a:graphicData>
+            </a:graphic>
+          </wp:inline>
+        </w:drawing>
+      </w:r>
+    </w:p>
+    <w:p>
+      <w:pPr>
+        <w:spacing w:after="200"/>
+        <w:jc w:val="center"/>
+      </w:pPr>
+      <w:r>
+        <w:rPr>
+          <w:rFonts w:ascii="Arial" w:hAnsi="Arial"/>
+          <w:b w:val="0"/>
+          <w:i/>
+          <w:color w:val="3C3C3C"/>
+          <w:sz w:val="19"/>
+        </w:rPr>
+        <w:t>Gambar 3.8: UI/UX Tampilan Web 1 - Halaman Login Sistem POS (Full Color)</w:t>
+      </w:r>
+    </w:p>
+    <w:p>
+      <w:pPr>
+        <w:keepNext/>
+        <w:spacing w:before="160" w:after="60"/>
+      </w:pPr>
+      <w:r>
+        <w:rPr>
+          <w:rFonts w:ascii="Arial" w:hAnsi="Arial"/>
+          <w:b/>
+          <w:i w:val="0"/>
+          <w:color w:val="000000"/>
+          <w:sz w:val="22"/>
+        </w:rPr>
+        <w:t>2. UI/UX Hasil Tampilan Web 2: Terminal Kasir POS Aktif</w:t>
       </w:r>
     </w:p>
     <w:p>
@@ -4478,7 +4567,7 @@
         <w:drawing>
           <wp:inline xmlns:a="http://schemas.openxmlformats.org/drawingml/2006/main" xmlns:pic="http://schemas.openxmlformats.org/drawingml/2006/picture">
             <wp:extent cx="5303520" cy="2960104"/>
-            <wp:docPr id="8" name="Picture 8"/>
+            <wp:docPr id="9" name="Picture 9"/>
             <wp:cNvGraphicFramePr>
               <a:graphicFrameLocks noChangeAspect="1"/>
             </wp:cNvGraphicFramePr>
@@ -4487,95 +4576,6 @@
                 <pic:pic>
                   <pic:nvPicPr>
                     <pic:cNvPr id="0" name="pos_cashier_mockup.jpg"/>
-                    <pic:cNvPicPr/>
-                  </pic:nvPicPr>
-                  <pic:blipFill>
-                    <a:blip r:embed="rId16"/>
-                    <a:stretch>
-                      <a:fillRect/>
-                    </a:stretch>
-                  </pic:blipFill>
-                  <pic:spPr>
-                    <a:xfrm>
-                      <a:off x="0" y="0"/>
-                      <a:ext cx="5303520" cy="2960104"/>
-                    </a:xfrm>
-                    <a:prstGeom prst="rect"/>
-                  </pic:spPr>
-                </pic:pic>
-              </a:graphicData>
-            </a:graphic>
-          </wp:inline>
-        </w:drawing>
-      </w:r>
-    </w:p>
-    <w:p>
-      <w:pPr>
-        <w:spacing w:after="200"/>
-        <w:jc w:val="center"/>
-      </w:pPr>
-      <w:r>
-        <w:rPr>
-          <w:rFonts w:ascii="Arial" w:hAnsi="Arial"/>
-          <w:b w:val="0"/>
-          <w:i/>
-          <w:color w:val="3C3C3C"/>
-          <w:sz w:val="19"/>
-        </w:rPr>
-        <w:t>Gambar 3.8: UI/UX Tampilan Web 1 - Terminal Kasir POS Aktif (Full Color)</w:t>
-      </w:r>
-    </w:p>
-    <w:p>
-      <w:pPr>
-        <w:keepNext/>
-        <w:spacing w:before="160" w:after="60"/>
-      </w:pPr>
-      <w:r>
-        <w:rPr>
-          <w:rFonts w:ascii="Arial" w:hAnsi="Arial"/>
-          <w:b/>
-          <w:i w:val="0"/>
-          <w:color w:val="000000"/>
-          <w:sz w:val="22"/>
-        </w:rPr>
-        <w:t>2. UI/UX Hasil Tampilan Web 2: Dashboard &amp; Manajemen Produk Admin</w:t>
-      </w:r>
-    </w:p>
-    <w:p>
-      <w:pPr>
-        <w:spacing w:after="80" w:line="276" w:lineRule="auto"/>
-      </w:pPr>
-      <w:r>
-        <w:rPr>
-          <w:rFonts w:ascii="Arial" w:hAnsi="Arial"/>
-          <w:b w:val="0"/>
-          <w:i w:val="0"/>
-          <w:color w:val="000000"/>
-          <w:sz w:val="22"/>
-        </w:rPr>
-        <w:t>Tampilan panel admin aktif di browser web dengan metrik penjualan real-time serta tabel CRUD master menu lengkap dengan thumbnail gambar:</w:t>
-      </w:r>
-    </w:p>
-    <w:p>
-      <w:pPr>
-        <w:spacing w:before="120" w:after="40"/>
-        <w:jc w:val="center"/>
-      </w:pPr>
-    </w:p>
-    <w:p>
-      <w:r>
-        <w:drawing>
-          <wp:inline xmlns:a="http://schemas.openxmlformats.org/drawingml/2006/main" xmlns:pic="http://schemas.openxmlformats.org/drawingml/2006/picture">
-            <wp:extent cx="5303520" cy="2960104"/>
-            <wp:docPr id="9" name="Picture 9"/>
-            <wp:cNvGraphicFramePr>
-              <a:graphicFrameLocks noChangeAspect="1"/>
-            </wp:cNvGraphicFramePr>
-            <a:graphic>
-              <a:graphicData uri="http://schemas.openxmlformats.org/drawingml/2006/picture">
-                <pic:pic>
-                  <pic:nvPicPr>
-                    <pic:cNvPr id="0" name="admin_dashboard_mockup.jpg"/>
                     <pic:cNvPicPr/>
                   </pic:nvPicPr>
                   <pic:blipFill>
@@ -4611,7 +4611,7 @@
           <w:color w:val="3C3C3C"/>
           <w:sz w:val="19"/>
         </w:rPr>
-        <w:t>Gambar 3.9: UI/UX Tampilan Web 2 - Dashboard &amp; Manajemen Menu Admin (Full Color)</w:t>
+        <w:t>Gambar 3.9: UI/UX Tampilan Web 2 - Terminal Kasir POS Aktif (Full Color)</w:t>
       </w:r>
     </w:p>
     <w:p>
@@ -4627,7 +4627,7 @@
           <w:color w:val="000000"/>
           <w:sz w:val="22"/>
         </w:rPr>
-        <w:t>3. UI/UX Hasil Tampilan Web 3: Format Cetak Struk Belanja &amp; Bukti Lunas</w:t>
+        <w:t>3. UI/UX Hasil Tampilan Web 3: Dashboard &amp; Manajemen Produk Admin</w:t>
       </w:r>
     </w:p>
     <w:p>
@@ -4642,46 +4642,51 @@
           <w:color w:val="000000"/>
           <w:sz w:val="22"/>
         </w:rPr>
-        <w:t>Tampilan dokumen bukti transaksi sah hasil cetak sistem kasir (mode Faktur Layar Penuh A4 atau Struk Mini Thermal 80mm). Kolom berikut disediakan bagi Anda untuk menempelkan hasil cetak struk dari browser kasir:</w:t>
+        <w:t>Tampilan panel admin aktif di browser web dengan metrik penjualan real-time serta tabel CRUD master menu lengkap dengan thumbnail gambar:</w:t>
       </w:r>
     </w:p>
-    <w:tbl>
-      <w:tblPr>
-        <w:tblW w:type="auto" w:w="0"/>
+    <w:p>
+      <w:pPr>
+        <w:spacing w:before="120" w:after="40"/>
         <w:jc w:val="center"/>
-        <w:tblLook w:firstColumn="1" w:firstRow="1" w:lastColumn="0" w:lastRow="0" w:noHBand="0" w:noVBand="1" w:val="04A0"/>
-      </w:tblPr>
-      <w:tblGrid>
-        <w:gridCol w:w="9360"/>
-      </w:tblGrid>
-      <w:tr>
-        <w:tc>
-          <w:tcPr>
-            <w:tcW w:type="dxa" w:w="8352"/>
-            <w:tcBorders w:top="single" w:top-val="single" w:top-sz="4" w:top-space="0" w:top-color="CCCCCC" w:left="single" w:left-val="single" w:left-sz="4" w:left-space="0" w:left-color="CCCCCC" w:bottom="single" w:bottom-val="single" w:bottom-sz="4" w:bottom-space="0" w:bottom-color="CCCCCC" w:right="single" w:right-val="single" w:right-sz="4" w:right-space="0" w:right-color="CCCCCC"/>
-            <w:shd w:fill="FAFAFA"/>
-          </w:tcPr>
-          <w:p>
-            <w:pPr>
-              <w:spacing w:before="720" w:after="720"/>
-              <w:jc w:val="center"/>
-            </w:pPr>
-            <w:r>
-              <w:rPr>
-                <w:rFonts w:ascii="Arial" w:hAnsi="Arial"/>
-                <w:b/>
-                <w:i w:val="0"/>
-                <w:color w:val="646464"/>
-                <w:sz w:val="20"/>
-              </w:rPr>
-              <w:t>[ TEMPELKAN SCREENSHOT CETAK STRUK BELANJA DI SINI ]</w:t>
-              <w:br/>
-              <w:t>(Klik di dalam kotak lalu Paste gambar / Insert Picture)</w:t>
-            </w:r>
-          </w:p>
-        </w:tc>
-      </w:tr>
-    </w:tbl>
+      </w:pPr>
+    </w:p>
+    <w:p>
+      <w:r>
+        <w:drawing>
+          <wp:inline xmlns:a="http://schemas.openxmlformats.org/drawingml/2006/main" xmlns:pic="http://schemas.openxmlformats.org/drawingml/2006/picture">
+            <wp:extent cx="5303520" cy="2960104"/>
+            <wp:docPr id="10" name="Picture 10"/>
+            <wp:cNvGraphicFramePr>
+              <a:graphicFrameLocks noChangeAspect="1"/>
+            </wp:cNvGraphicFramePr>
+            <a:graphic>
+              <a:graphicData uri="http://schemas.openxmlformats.org/drawingml/2006/picture">
+                <pic:pic>
+                  <pic:nvPicPr>
+                    <pic:cNvPr id="0" name="admin_dashboard_mockup.jpg"/>
+                    <pic:cNvPicPr/>
+                  </pic:nvPicPr>
+                  <pic:blipFill>
+                    <a:blip r:embed="rId18"/>
+                    <a:stretch>
+                      <a:fillRect/>
+                    </a:stretch>
+                  </pic:blipFill>
+                  <pic:spPr>
+                    <a:xfrm>
+                      <a:off x="0" y="0"/>
+                      <a:ext cx="5303520" cy="2960104"/>
+                    </a:xfrm>
+                    <a:prstGeom prst="rect"/>
+                  </pic:spPr>
+                </pic:pic>
+              </a:graphicData>
+            </a:graphic>
+          </wp:inline>
+        </w:drawing>
+      </w:r>
+    </w:p>
     <w:p>
       <w:pPr>
         <w:spacing w:after="200"/>
@@ -4695,7 +4700,7 @@
           <w:color w:val="3C3C3C"/>
           <w:sz w:val="19"/>
         </w:rPr>
-        <w:t>Gambar 3.10: UI/UX Tampilan Web 3 - Hasil Cetak Struk Belanja Transaksi</w:t>
+        <w:t>Gambar 3.10: UI/UX Tampilan Web 3 - Dashboard &amp; Manajemen Menu Admin (Full Color)</w:t>
       </w:r>
     </w:p>
     <w:p>

</xml_diff>